<commit_message>
Se actualiza manual e instalador
</commit_message>
<xml_diff>
--- a/Manual/Manual de uso.docx
+++ b/Manual/Manual de uso.docx
@@ -7440,10 +7440,7 @@
       </w:r>
       <w:proofErr w:type="spellEnd"/>
       <w:r>
-        <w:t>.</w:t>
-      </w:r>
-      <w:r>
-        <w:t xml:space="preserve"> El </w:t>
+        <w:t xml:space="preserve">. El </w:t>
       </w:r>
       <w:proofErr w:type="spellStart"/>
       <w:r>
@@ -8859,6 +8856,291 @@
     </w:p>
     <w:p>
       <w:r>
+        <w:t>Formato para los catálogos (botón 'Importar desde Excel' en Administración &gt; Tipos de novedad, Dotaciones y Personal de estación): se lee la primera columna de la primera hoja del archivo; las demás columnas y hojas se ignoran y el nombre de la hoja no importa (a diferencia de los importes de BASE, NOVEDADES y Cambio de Turnos). La primera fila se omite si su texto es un encabezado conocido.</w:t>
+      </w:r>
+    </w:p>
+    <w:tbl>
+      <w:tblPr>
+        <w:tblStyle w:val="Cuadrculaclara-nfasis1"/>
+        <w:tblW w:w="9923" w:type="dxa"/>
+        <w:tblInd w:w="-459" w:type="dxa"/>
+        <w:tblLook w:val="04A0" w:firstRow="1" w:lastRow="0" w:firstColumn="1" w:lastColumn="0" w:noHBand="0" w:noVBand="1"/>
+      </w:tblPr>
+      <w:tblGrid>
+        <w:gridCol w:w="2127"/>
+        <w:gridCol w:w="1559"/>
+        <w:gridCol w:w="2977"/>
+        <w:gridCol w:w="3260"/>
+      </w:tblGrid>
+      <w:tr>
+        <w:trPr>
+          <w:cnfStyle w:val="100000000000" w:firstRow="1" w:lastRow="0" w:firstColumn="0" w:lastColumn="0" w:oddVBand="0" w:evenVBand="0" w:oddHBand="0" w:evenHBand="0" w:firstRowFirstColumn="0" w:firstRowLastColumn="0" w:lastRowFirstColumn="0" w:lastRowLastColumn="0"/>
+          <w:trHeight w:val="265"/>
+        </w:trPr>
+        <w:tc>
+          <w:tcPr>
+            <w:cnfStyle w:val="001000000000" w:firstRow="0" w:lastRow="0" w:firstColumn="1" w:lastColumn="0" w:oddVBand="0" w:evenVBand="0" w:oddHBand="0" w:evenHBand="0" w:firstRowFirstColumn="0" w:firstRowLastColumn="0" w:lastRowFirstColumn="0" w:lastRowLastColumn="0"/>
+            <w:tcW w:w="2127" w:type="dxa"/>
+          </w:tcPr>
+          <w:p>
+            <w:proofErr w:type="spellStart"/>
+            <w:r>
+              <w:t>Catálogo</w:t>
+            </w:r>
+            <w:proofErr w:type="spellEnd"/>
+          </w:p>
+        </w:tc>
+        <w:tc>
+          <w:tcPr>
+            <w:tcW w:w="1559" w:type="dxa"/>
+          </w:tcPr>
+          <w:p>
+            <w:pPr>
+              <w:cnfStyle w:val="100000000000" w:firstRow="1" w:lastRow="0" w:firstColumn="0" w:lastColumn="0" w:oddVBand="0" w:evenVBand="0" w:oddHBand="0" w:evenHBand="0" w:firstRowFirstColumn="0" w:firstRowLastColumn="0" w:lastRowFirstColumn="0" w:lastRowLastColumn="0"/>
+            </w:pPr>
+            <w:r>
+              <w:t>Hoja utilizada</w:t>
+            </w:r>
+          </w:p>
+        </w:tc>
+        <w:tc>
+          <w:tcPr>
+            <w:tcW w:w="2977" w:type="dxa"/>
+          </w:tcPr>
+          <w:p>
+            <w:pPr>
+              <w:cnfStyle w:val="100000000000" w:firstRow="1" w:lastRow="0" w:firstColumn="0" w:lastColumn="0" w:oddVBand="0" w:evenVBand="0" w:oddHBand="0" w:evenHBand="0" w:firstRowFirstColumn="0" w:firstRowLastColumn="0" w:lastRowFirstColumn="0" w:lastRowLastColumn="0"/>
+            </w:pPr>
+            <w:r>
+              <w:t>Contenido (columna A)</w:t>
+            </w:r>
+          </w:p>
+        </w:tc>
+        <w:tc>
+          <w:tcPr>
+            <w:tcW w:w="3260" w:type="dxa"/>
+          </w:tcPr>
+          <w:p>
+            <w:pPr>
+              <w:cnfStyle w:val="100000000000" w:firstRow="1" w:lastRow="0" w:firstColumn="0" w:lastColumn="0" w:oddVBand="0" w:evenVBand="0" w:oddHBand="0" w:evenHBand="0" w:firstRowFirstColumn="0" w:firstRowLastColumn="0" w:lastRowFirstColumn="0" w:lastRowLastColumn="0"/>
+            </w:pPr>
+            <w:r>
+              <w:t>Encabezado que se omite (fila 1)</w:t>
+            </w:r>
+          </w:p>
+        </w:tc>
+      </w:tr>
+      <w:tr>
+        <w:trPr>
+          <w:cnfStyle w:val="000000100000" w:firstRow="0" w:lastRow="0" w:firstColumn="0" w:lastColumn="0" w:oddVBand="0" w:evenVBand="0" w:oddHBand="1" w:evenHBand="0" w:firstRowFirstColumn="0" w:firstRowLastColumn="0" w:lastRowFirstColumn="0" w:lastRowLastColumn="0"/>
+        </w:trPr>
+        <w:tc>
+          <w:tcPr>
+            <w:cnfStyle w:val="001000000000" w:firstRow="0" w:lastRow="0" w:firstColumn="1" w:lastColumn="0" w:oddVBand="0" w:evenVBand="0" w:oddHBand="0" w:evenHBand="0" w:firstRowFirstColumn="0" w:firstRowLastColumn="0" w:lastRowFirstColumn="0" w:lastRowLastColumn="0"/>
+            <w:tcW w:w="2127" w:type="dxa"/>
+          </w:tcPr>
+          <w:p>
+            <w:proofErr w:type="spellStart"/>
+            <w:r>
+              <w:t>Tipos</w:t>
+            </w:r>
+            <w:proofErr w:type="spellEnd"/>
+            <w:r>
+              <w:t xml:space="preserve"> de </w:t>
+            </w:r>
+            <w:proofErr w:type="spellStart"/>
+            <w:r>
+              <w:t>novedad</w:t>
+            </w:r>
+            <w:proofErr w:type="spellEnd"/>
+          </w:p>
+        </w:tc>
+        <w:tc>
+          <w:tcPr>
+            <w:tcW w:w="1559" w:type="dxa"/>
+          </w:tcPr>
+          <w:p>
+            <w:pPr>
+              <w:cnfStyle w:val="000000100000" w:firstRow="0" w:lastRow="0" w:firstColumn="0" w:lastColumn="0" w:oddVBand="0" w:evenVBand="0" w:oddHBand="1" w:evenHBand="0" w:firstRowFirstColumn="0" w:firstRowLastColumn="0" w:lastRowFirstColumn="0" w:lastRowLastColumn="0"/>
+            </w:pPr>
+            <w:r>
+              <w:t>primera hoja</w:t>
+            </w:r>
+          </w:p>
+        </w:tc>
+        <w:tc>
+          <w:tcPr>
+            <w:tcW w:w="2977" w:type="dxa"/>
+          </w:tcPr>
+          <w:p>
+            <w:pPr>
+              <w:cnfStyle w:val="000000100000" w:firstRow="0" w:lastRow="0" w:firstColumn="0" w:lastColumn="0" w:oddVBand="0" w:evenVBand="0" w:oddHBand="1" w:evenHBand="0" w:firstRowFirstColumn="0" w:firstRowLastColumn="0" w:lastRowFirstColumn="0" w:lastRowLastColumn="0"/>
+            </w:pPr>
+            <w:r>
+              <w:t>nombres de tipos de novedad</w:t>
+            </w:r>
+          </w:p>
+        </w:tc>
+        <w:tc>
+          <w:tcPr>
+            <w:tcW w:w="3260" w:type="dxa"/>
+          </w:tcPr>
+          <w:p>
+            <w:pPr>
+              <w:cnfStyle w:val="000000100000" w:firstRow="0" w:lastRow="0" w:firstColumn="0" w:lastColumn="0" w:oddVBand="0" w:evenVBand="0" w:oddHBand="1" w:evenHBand="0" w:firstRowFirstColumn="0" w:firstRowLastColumn="0" w:lastRowFirstColumn="0" w:lastRowLastColumn="0"/>
+            </w:pPr>
+            <w:r>
+              <w:t>TIPO, NOVEDAD</w:t>
+            </w:r>
+          </w:p>
+        </w:tc>
+      </w:tr>
+      <w:tr>
+        <w:trPr>
+          <w:cnfStyle w:val="000000010000" w:firstRow="0" w:lastRow="0" w:firstColumn="0" w:lastColumn="0" w:oddVBand="0" w:evenVBand="0" w:oddHBand="0" w:evenHBand="1" w:firstRowFirstColumn="0" w:firstRowLastColumn="0" w:lastRowFirstColumn="0" w:lastRowLastColumn="0"/>
+        </w:trPr>
+        <w:tc>
+          <w:tcPr>
+            <w:cnfStyle w:val="001000000000" w:firstRow="0" w:lastRow="0" w:firstColumn="1" w:lastColumn="0" w:oddVBand="0" w:evenVBand="0" w:oddHBand="0" w:evenHBand="0" w:firstRowFirstColumn="0" w:firstRowLastColumn="0" w:lastRowFirstColumn="0" w:lastRowLastColumn="0"/>
+            <w:tcW w:w="2127" w:type="dxa"/>
+          </w:tcPr>
+          <w:p>
+            <w:r>
+              <w:t>Dotaciones</w:t>
+            </w:r>
+          </w:p>
+        </w:tc>
+        <w:tc>
+          <w:tcPr>
+            <w:tcW w:w="1559" w:type="dxa"/>
+          </w:tcPr>
+          <w:p>
+            <w:pPr>
+              <w:cnfStyle w:val="000000010000" w:firstRow="0" w:lastRow="0" w:firstColumn="0" w:lastColumn="0" w:oddVBand="0" w:evenVBand="0" w:oddHBand="0" w:evenHBand="1" w:firstRowFirstColumn="0" w:firstRowLastColumn="0" w:lastRowFirstColumn="0" w:lastRowLastColumn="0"/>
+            </w:pPr>
+            <w:r>
+              <w:t>primera hoja</w:t>
+            </w:r>
+          </w:p>
+        </w:tc>
+        <w:tc>
+          <w:tcPr>
+            <w:tcW w:w="2977" w:type="dxa"/>
+          </w:tcPr>
+          <w:p>
+            <w:pPr>
+              <w:cnfStyle w:val="000000010000" w:firstRow="0" w:lastRow="0" w:firstColumn="0" w:lastColumn="0" w:oddVBand="0" w:evenVBand="0" w:oddHBand="0" w:evenHBand="1" w:firstRowFirstColumn="0" w:firstRowLastColumn="0" w:lastRowFirstColumn="0" w:lastRowLastColumn="0"/>
+            </w:pPr>
+            <w:r>
+              <w:t>nombres de dotaciones</w:t>
+            </w:r>
+          </w:p>
+        </w:tc>
+        <w:tc>
+          <w:tcPr>
+            <w:tcW w:w="3260" w:type="dxa"/>
+          </w:tcPr>
+          <w:p>
+            <w:pPr>
+              <w:cnfStyle w:val="000000010000" w:firstRow="0" w:lastRow="0" w:firstColumn="0" w:lastColumn="0" w:oddVBand="0" w:evenVBand="0" w:oddHBand="0" w:evenHBand="1" w:firstRowFirstColumn="0" w:firstRowLastColumn="0" w:lastRowFirstColumn="0" w:lastRowLastColumn="0"/>
+            </w:pPr>
+            <w:r>
+              <w:t>DOTACION</w:t>
+            </w:r>
+          </w:p>
+        </w:tc>
+      </w:tr>
+      <w:tr>
+        <w:trPr>
+          <w:cnfStyle w:val="000000100000" w:firstRow="0" w:lastRow="0" w:firstColumn="0" w:lastColumn="0" w:oddVBand="0" w:evenVBand="0" w:oddHBand="1" w:evenHBand="0" w:firstRowFirstColumn="0" w:firstRowLastColumn="0" w:lastRowFirstColumn="0" w:lastRowLastColumn="0"/>
+        </w:trPr>
+        <w:tc>
+          <w:tcPr>
+            <w:cnfStyle w:val="001000000000" w:firstRow="0" w:lastRow="0" w:firstColumn="1" w:lastColumn="0" w:oddVBand="0" w:evenVBand="0" w:oddHBand="0" w:evenHBand="0" w:firstRowFirstColumn="0" w:firstRowLastColumn="0" w:lastRowFirstColumn="0" w:lastRowLastColumn="0"/>
+            <w:tcW w:w="2127" w:type="dxa"/>
+          </w:tcPr>
+          <w:p>
+            <w:r>
+              <w:t>Personal de estación</w:t>
+            </w:r>
+          </w:p>
+        </w:tc>
+        <w:tc>
+          <w:tcPr>
+            <w:tcW w:w="1559" w:type="dxa"/>
+          </w:tcPr>
+          <w:p>
+            <w:pPr>
+              <w:cnfStyle w:val="000000100000" w:firstRow="0" w:lastRow="0" w:firstColumn="0" w:lastColumn="0" w:oddVBand="0" w:evenVBand="0" w:oddHBand="1" w:evenHBand="0" w:firstRowFirstColumn="0" w:firstRowLastColumn="0" w:lastRowFirstColumn="0" w:lastRowLastColumn="0"/>
+            </w:pPr>
+            <w:r>
+              <w:t>primera hoja</w:t>
+            </w:r>
+          </w:p>
+        </w:tc>
+        <w:tc>
+          <w:tcPr>
+            <w:tcW w:w="2977" w:type="dxa"/>
+          </w:tcPr>
+          <w:p>
+            <w:pPr>
+              <w:cnfStyle w:val="000000100000" w:firstRow="0" w:lastRow="0" w:firstColumn="0" w:lastColumn="0" w:oddVBand="0" w:evenVBand="0" w:oddHBand="1" w:evenHBand="0" w:firstRowFirstColumn="0" w:firstRowLastColumn="0" w:lastRowFirstColumn="0" w:lastRowLastColumn="0"/>
+            </w:pPr>
+            <w:r>
+              <w:t>nombres del personal de estación</w:t>
+            </w:r>
+          </w:p>
+        </w:tc>
+        <w:tc>
+          <w:tcPr>
+            <w:tcW w:w="3260" w:type="dxa"/>
+          </w:tcPr>
+          <w:p>
+            <w:pPr>
+              <w:cnfStyle w:val="000000100000" w:firstRow="0" w:lastRow="0" w:firstColumn="0" w:lastColumn="0" w:oddVBand="0" w:evenVBand="0" w:oddHBand="1" w:evenHBand="0" w:firstRowFirstColumn="0" w:firstRowLastColumn="0" w:lastRowFirstColumn="0" w:lastRowLastColumn="0"/>
+            </w:pPr>
+            <w:r>
+              <w:t>NOMBRE, PERSONAL</w:t>
+            </w:r>
+          </w:p>
+        </w:tc>
+      </w:tr>
+    </w:tbl>
+    <w:p>
+      <w:pPr>
+        <w:pStyle w:val="Listaconvietas"/>
+      </w:pPr>
+      <w:r>
+        <w:lastRenderedPageBreak/>
+        <w:t xml:space="preserve">Al </w:t>
+      </w:r>
+      <w:proofErr w:type="spellStart"/>
+      <w:r>
+        <w:t>importar</w:t>
+      </w:r>
+      <w:proofErr w:type="spellEnd"/>
+      <w:r>
+        <w:t xml:space="preserve"> un </w:t>
+      </w:r>
+      <w:proofErr w:type="spellStart"/>
+      <w:r>
+        <w:t>catálogo</w:t>
+      </w:r>
+      <w:proofErr w:type="spellEnd"/>
+      <w:r>
+        <w:t xml:space="preserve"> se pregunta si se desea desactivar todos los registros actuales antes de importar; si se acepta, los nombres que no estén en el Excel quedan desactivados (no se eliminan). Los nombres que ya existían se reactivan.</w:t>
+      </w:r>
+    </w:p>
+    <w:p>
+      <w:pPr>
+        <w:pStyle w:val="Listaconvietas"/>
+      </w:pPr>
+      <w:r>
+        <w:t>El 'Exportar a Excel' de Personal de estación genera una hoja 'PersonalEstacion' con columnas NOMBRE y ACTIVO; ese archivo se puede volver a importar con el mismo botón.</w:t>
+      </w:r>
+    </w:p>
+    <w:p>
+      <w:r>
         <w:t xml:space="preserve">El </w:t>
       </w:r>
       <w:proofErr w:type="spellStart"/>
@@ -9219,7 +9501,6 @@
       </w:pPr>
       <w:bookmarkStart w:id="20" w:name="_Toc237787096"/>
       <w:r>
-        <w:lastRenderedPageBreak/>
         <w:t xml:space="preserve">8. </w:t>
       </w:r>
       <w:proofErr w:type="spellStart"/>
@@ -10193,6 +10474,7 @@
       </w:pPr>
       <w:bookmarkStart w:id="25" w:name="_Toc237787101"/>
       <w:r>
+        <w:lastRenderedPageBreak/>
         <w:t xml:space="preserve">9.2 Roles y </w:t>
       </w:r>
       <w:proofErr w:type="spellStart"/>
@@ -10927,7 +11209,6 @@
     <w:p>
       <w:proofErr w:type="spellStart"/>
       <w:r>
-        <w:lastRenderedPageBreak/>
         <w:t>Permiten</w:t>
       </w:r>
       <w:proofErr w:type="spellEnd"/>
@@ -11068,7 +11349,7 @@
       </w:r>
       <w:proofErr w:type="spellEnd"/>
       <w:r>
-        <w:t>.</w:t>
+        <w:t>. El formato de la tabla para importar se describe en la sección 7.1.</w:t>
       </w:r>
     </w:p>
     <w:p>
@@ -11785,6 +12066,7 @@
       </w:r>
       <w:proofErr w:type="spellStart"/>
       <w:r>
+        <w:lastRenderedPageBreak/>
         <w:t>copias</w:t>
       </w:r>
       <w:proofErr w:type="spellEnd"/>
@@ -12462,7 +12744,6 @@
       </w:pPr>
       <w:bookmarkStart w:id="37" w:name="_Toc237787113"/>
       <w:r>
-        <w:lastRenderedPageBreak/>
         <w:t xml:space="preserve">10.2 </w:t>
       </w:r>
       <w:proofErr w:type="spellStart"/>
@@ -13486,6 +13767,7 @@
           </w:tcPr>
           <w:p>
             <w:r>
+              <w:lastRenderedPageBreak/>
               <w:t xml:space="preserve">No se </w:t>
             </w:r>
             <w:proofErr w:type="spellStart"/>
@@ -14421,7 +14703,6 @@
           </w:tcPr>
           <w:p>
             <w:r>
-              <w:lastRenderedPageBreak/>
               <w:t xml:space="preserve">Roles y </w:t>
             </w:r>
             <w:proofErr w:type="spellStart"/>

</xml_diff>

<commit_message>
dashboard: cuarta estadistica por dia de semana, graficos 2x2 de 300px centrados; permiso tiposNovedad.administrar y foco en login
</commit_message>
<xml_diff>
--- a/Manual/Manual de uso.docx
+++ b/Manual/Manual de uso.docx
@@ -14580,6 +14580,28 @@
               <w:t>administrar</w:t>
             </w:r>
             <w:proofErr w:type="spellEnd"/>
+          </w:p>
+        </w:tc>
+      </w:tr>
+      <w:tr>
+        <w:tc>
+          <w:tcPr>
+            <w:tcW w:type="dxa" w:w="4320"/>
+          </w:tcPr>
+          <w:p>
+            <w:r>
+              <w:t>Tipos de novedad</w:t>
+            </w:r>
+          </w:p>
+        </w:tc>
+        <w:tc>
+          <w:tcPr>
+            <w:tcW w:type="dxa" w:w="4320"/>
+          </w:tcPr>
+          <w:p>
+            <w:r>
+              <w:t>administrar</w:t>
+            </w:r>
           </w:p>
         </w:tc>
       </w:tr>

</xml_diff>

<commit_message>
olvide mi contrasena: envio de contrasena temporal por Outlook (usuario+dominio) y caducidad de claves editable (90 dias por defecto)
</commit_message>
<xml_diff>
--- a/Manual/Manual de uso.docx
+++ b/Manual/Manual de uso.docx
@@ -4509,6 +4509,26 @@
     </w:p>
     <w:p>
       <w:pPr>
+        <w:pStyle w:val="Ttulo2"/>
+      </w:pPr>
+      <w:r>
+        <w:t>2.5 Recuperar contraseña</w:t>
+      </w:r>
+    </w:p>
+    <w:p>
+      <w:pPr/>
+      <w:r>
+        <w:t>Si olvidó su contraseña, en la pantalla de inicio de sesión presione '¿Olvidó su contraseña?' e ingrese su usuario. La aplicación genera una contraseña temporal y la envía por correo electrónico al correo de ese usuario (usuario + dominio configurado, por ejemplo usuario@trenesargentinos.gob.ar).</w:t>
+      </w:r>
+    </w:p>
+    <w:p>
+      <w:pPr/>
+      <w:r>
+        <w:t>Al ingresar con la contraseña temporal, la aplicación pide cambiarla de forma obligatoria antes de continuar. Las contraseñas también caducan: al vencer el período de validez configurado (por defecto 90 días) se pide cambiarla al iniciar sesión. El período y el dominio de correo se configuran en Administración → Contraseñas y recuperación. Si el envío por Outlook falla, contacte al administrador.</w:t>
+      </w:r>
+    </w:p>
+    <w:p>
+      <w:pPr>
         <w:pStyle w:val="Ttulo1"/>
       </w:pPr>
       <w:bookmarkStart w:id="9" w:name="_Toc237787085"/>
@@ -4532,248 +4552,128 @@
     </w:p>
     <w:p>
       <w:r>
-        <w:t xml:space="preserve">Al </w:t>
-      </w:r>
-      <w:proofErr w:type="spellStart"/>
-      <w:r>
-        <w:t>iniciar</w:t>
-      </w:r>
-      <w:proofErr w:type="spellEnd"/>
-      <w:r>
-        <w:t xml:space="preserve"> </w:t>
-      </w:r>
-      <w:proofErr w:type="spellStart"/>
-      <w:r>
-        <w:t>sesión</w:t>
-      </w:r>
-      <w:proofErr w:type="spellEnd"/>
-      <w:r>
-        <w:t xml:space="preserve"> se </w:t>
-      </w:r>
-      <w:proofErr w:type="spellStart"/>
-      <w:r>
-        <w:t>muestra</w:t>
-      </w:r>
-      <w:proofErr w:type="spellEnd"/>
-      <w:r>
-        <w:t xml:space="preserve"> el 'Panel de control' (</w:t>
-      </w:r>
-      <w:proofErr w:type="spellStart"/>
-      <w:r>
-        <w:t>si</w:t>
-      </w:r>
-      <w:proofErr w:type="spellEnd"/>
-      <w:r>
-        <w:t xml:space="preserve"> el </w:t>
-      </w:r>
-      <w:proofErr w:type="spellStart"/>
-      <w:r>
-        <w:t>usuario</w:t>
-      </w:r>
-      <w:proofErr w:type="spellEnd"/>
-      <w:r>
-        <w:t xml:space="preserve"> </w:t>
-      </w:r>
-      <w:proofErr w:type="spellStart"/>
-      <w:r>
-        <w:t>puede</w:t>
-      </w:r>
-      <w:proofErr w:type="spellEnd"/>
-      <w:r>
-        <w:t xml:space="preserve"> </w:t>
-      </w:r>
-      <w:proofErr w:type="spellStart"/>
-      <w:r>
-        <w:t>ver</w:t>
-      </w:r>
-      <w:proofErr w:type="spellEnd"/>
-      <w:r>
-        <w:t xml:space="preserve"> </w:t>
-      </w:r>
-      <w:proofErr w:type="spellStart"/>
-      <w:r>
-        <w:t>novedades</w:t>
-      </w:r>
-      <w:proofErr w:type="spellEnd"/>
-      <w:r>
-        <w:t xml:space="preserve"> o </w:t>
-      </w:r>
-      <w:proofErr w:type="spellStart"/>
-      <w:r>
-        <w:t>cambios</w:t>
-      </w:r>
-      <w:proofErr w:type="spellEnd"/>
-      <w:r>
-        <w:t xml:space="preserve"> de </w:t>
-      </w:r>
-      <w:proofErr w:type="spellStart"/>
-      <w:r>
-        <w:t>turno</w:t>
-      </w:r>
-      <w:proofErr w:type="spellEnd"/>
-      <w:r>
-        <w:t xml:space="preserve">). </w:t>
-      </w:r>
-      <w:proofErr w:type="spellStart"/>
-      <w:r>
-        <w:t>Incluye</w:t>
-      </w:r>
-      <w:proofErr w:type="spellEnd"/>
-      <w:r>
-        <w:t xml:space="preserve"> </w:t>
-      </w:r>
-      <w:proofErr w:type="spellStart"/>
-      <w:r>
-        <w:t>tarjetas</w:t>
-      </w:r>
-      <w:proofErr w:type="spellEnd"/>
-      <w:r>
-        <w:t xml:space="preserve"> de </w:t>
-      </w:r>
-      <w:proofErr w:type="spellStart"/>
-      <w:r>
-        <w:t>resumen</w:t>
-      </w:r>
-      <w:proofErr w:type="spellEnd"/>
-      <w:r>
-        <w:t xml:space="preserve"> (</w:t>
-      </w:r>
-      <w:proofErr w:type="spellStart"/>
-      <w:r>
-        <w:t>novedades</w:t>
-      </w:r>
-      <w:proofErr w:type="spellEnd"/>
-      <w:r>
-        <w:t xml:space="preserve"> de hoy, </w:t>
-      </w:r>
-      <w:proofErr w:type="spellStart"/>
-      <w:r>
-        <w:t>cambios</w:t>
-      </w:r>
-      <w:proofErr w:type="spellEnd"/>
-      <w:r>
-        <w:t xml:space="preserve"> de </w:t>
-      </w:r>
-      <w:proofErr w:type="spellStart"/>
-      <w:r>
-        <w:t>turno</w:t>
-      </w:r>
-      <w:proofErr w:type="spellEnd"/>
-      <w:r>
-        <w:t xml:space="preserve"> de hoy, </w:t>
-      </w:r>
-      <w:proofErr w:type="spellStart"/>
-      <w:r>
-        <w:t>registros</w:t>
-      </w:r>
-      <w:proofErr w:type="spellEnd"/>
-      <w:r>
-        <w:t xml:space="preserve"> del </w:t>
-      </w:r>
-      <w:proofErr w:type="spellStart"/>
-      <w:r>
-        <w:t>mes</w:t>
-      </w:r>
-      <w:proofErr w:type="spellEnd"/>
-      <w:r>
-        <w:t xml:space="preserve"> y </w:t>
-      </w:r>
-      <w:proofErr w:type="spellStart"/>
-      <w:r>
-        <w:t>registros</w:t>
-      </w:r>
-      <w:proofErr w:type="spellEnd"/>
-      <w:r>
-        <w:t xml:space="preserve"> sin </w:t>
-      </w:r>
-      <w:proofErr w:type="spellStart"/>
-      <w:r>
-        <w:t>revisar</w:t>
-      </w:r>
-      <w:proofErr w:type="spellEnd"/>
-      <w:r>
-        <w:t xml:space="preserve">) y </w:t>
-      </w:r>
-      <w:proofErr w:type="spellStart"/>
-      <w:r>
-        <w:t>gráficos</w:t>
-      </w:r>
-      <w:proofErr w:type="spellEnd"/>
-      <w:r>
-        <w:t xml:space="preserve"> </w:t>
-      </w:r>
-      <w:proofErr w:type="spellStart"/>
-      <w:r>
-        <w:t>por</w:t>
-      </w:r>
-      <w:proofErr w:type="spellEnd"/>
-      <w:r>
-        <w:t xml:space="preserve"> </w:t>
-      </w:r>
-      <w:proofErr w:type="spellStart"/>
-      <w:r>
-        <w:t>tipo</w:t>
-      </w:r>
-      <w:proofErr w:type="spellEnd"/>
-      <w:r>
-        <w:t xml:space="preserve"> de </w:t>
-      </w:r>
-      <w:proofErr w:type="spellStart"/>
-      <w:r>
-        <w:t>novedad</w:t>
-      </w:r>
-      <w:proofErr w:type="spellEnd"/>
-      <w:r>
-        <w:t xml:space="preserve">, </w:t>
-      </w:r>
-      <w:proofErr w:type="spellStart"/>
-      <w:r>
-        <w:t>por</w:t>
-      </w:r>
-      <w:proofErr w:type="spellEnd"/>
-      <w:r>
-        <w:t xml:space="preserve"> </w:t>
-      </w:r>
-      <w:proofErr w:type="spellStart"/>
-      <w:r>
-        <w:t>dotación</w:t>
-      </w:r>
-      <w:proofErr w:type="spellEnd"/>
-      <w:r>
-        <w:t xml:space="preserve"> y la </w:t>
-      </w:r>
-      <w:proofErr w:type="spellStart"/>
-      <w:r>
-        <w:t>tendencia</w:t>
-      </w:r>
-      <w:proofErr w:type="spellEnd"/>
-      <w:r>
-        <w:t xml:space="preserve"> de </w:t>
-      </w:r>
-      <w:proofErr w:type="spellStart"/>
-      <w:r>
-        <w:t>los</w:t>
-      </w:r>
-      <w:proofErr w:type="spellEnd"/>
-      <w:r>
-        <w:t xml:space="preserve"> </w:t>
-      </w:r>
-      <w:proofErr w:type="spellStart"/>
-      <w:r>
-        <w:t>últimos</w:t>
-      </w:r>
-      <w:proofErr w:type="spellEnd"/>
-      <w:r>
-        <w:t xml:space="preserve"> 7, 30 o 90 días (selector </w:t>
-      </w:r>
-      <w:proofErr w:type="spellStart"/>
-      <w:r>
-        <w:t>en</w:t>
-      </w:r>
-      <w:proofErr w:type="spellEnd"/>
-      <w:r>
-        <w:t xml:space="preserve"> la barra superior).</w:t>
-      </w:r>
+        <w:t>Al iniciar sesión se muestra el 'Panel de control' (si el usuario puede ver novedades o cambios de turno). Incluye tarjetas de resumen (novedades de hoy, cambios de turno de hoy, registros del mes y registros sin revisar) y gráficos por tipo de novedad, por dotación, por día de semana y la tendencia de los últimos 7, 30 o 90 días (selector en la barra superior).</w:t>
+      </w:r>
+      <w:proofErr w:type="spellStart"/>
+      <w:r/>
+      <w:proofErr w:type="spellEnd"/>
+      <w:r/>
+      <w:proofErr w:type="spellStart"/>
+      <w:r/>
+      <w:proofErr w:type="spellEnd"/>
+      <w:r/>
+      <w:proofErr w:type="spellStart"/>
+      <w:r/>
+      <w:proofErr w:type="spellEnd"/>
+      <w:r/>
+      <w:proofErr w:type="spellStart"/>
+      <w:r/>
+      <w:proofErr w:type="spellEnd"/>
+      <w:r/>
+      <w:proofErr w:type="spellStart"/>
+      <w:r/>
+      <w:proofErr w:type="spellEnd"/>
+      <w:r/>
+      <w:proofErr w:type="spellStart"/>
+      <w:r/>
+      <w:proofErr w:type="spellEnd"/>
+      <w:r/>
+      <w:proofErr w:type="spellStart"/>
+      <w:r/>
+      <w:proofErr w:type="spellEnd"/>
+      <w:r/>
+      <w:proofErr w:type="spellStart"/>
+      <w:r/>
+      <w:proofErr w:type="spellEnd"/>
+      <w:r/>
+      <w:proofErr w:type="spellStart"/>
+      <w:r/>
+      <w:proofErr w:type="spellEnd"/>
+      <w:r/>
+      <w:proofErr w:type="spellStart"/>
+      <w:r/>
+      <w:proofErr w:type="spellEnd"/>
+      <w:r/>
+      <w:proofErr w:type="spellStart"/>
+      <w:r/>
+      <w:proofErr w:type="spellEnd"/>
+      <w:r/>
+      <w:proofErr w:type="spellStart"/>
+      <w:r/>
+      <w:proofErr w:type="spellEnd"/>
+      <w:r/>
+      <w:proofErr w:type="spellStart"/>
+      <w:r/>
+      <w:proofErr w:type="spellEnd"/>
+      <w:r/>
+      <w:proofErr w:type="spellStart"/>
+      <w:r/>
+      <w:proofErr w:type="spellEnd"/>
+      <w:r/>
+      <w:proofErr w:type="spellStart"/>
+      <w:r/>
+      <w:proofErr w:type="spellEnd"/>
+      <w:r/>
+      <w:proofErr w:type="spellStart"/>
+      <w:r/>
+      <w:proofErr w:type="spellEnd"/>
+      <w:r/>
+      <w:proofErr w:type="spellStart"/>
+      <w:r/>
+      <w:proofErr w:type="spellEnd"/>
+      <w:r/>
+      <w:proofErr w:type="spellStart"/>
+      <w:r/>
+      <w:proofErr w:type="spellEnd"/>
+      <w:r/>
+      <w:proofErr w:type="spellStart"/>
+      <w:r/>
+      <w:proofErr w:type="spellEnd"/>
+      <w:r/>
+      <w:proofErr w:type="spellStart"/>
+      <w:r/>
+      <w:proofErr w:type="spellEnd"/>
+      <w:r/>
+      <w:proofErr w:type="spellStart"/>
+      <w:r/>
+      <w:proofErr w:type="spellEnd"/>
+      <w:r/>
+      <w:proofErr w:type="spellStart"/>
+      <w:r/>
+      <w:proofErr w:type="spellEnd"/>
+      <w:r/>
+      <w:proofErr w:type="spellStart"/>
+      <w:r/>
+      <w:proofErr w:type="spellEnd"/>
+      <w:r/>
+      <w:proofErr w:type="spellStart"/>
+      <w:r/>
+      <w:proofErr w:type="spellEnd"/>
+      <w:r/>
+      <w:proofErr w:type="spellStart"/>
+      <w:r/>
+      <w:proofErr w:type="spellEnd"/>
+      <w:r/>
+      <w:proofErr w:type="spellStart"/>
+      <w:r/>
+      <w:proofErr w:type="spellEnd"/>
+      <w:r/>
+      <w:proofErr w:type="spellStart"/>
+      <w:r/>
+      <w:proofErr w:type="spellEnd"/>
+      <w:r/>
+      <w:proofErr w:type="spellStart"/>
+      <w:r/>
+      <w:proofErr w:type="spellEnd"/>
+      <w:r/>
+      <w:proofErr w:type="spellStart"/>
+      <w:r/>
+      <w:proofErr w:type="spellEnd"/>
+      <w:r/>
+      <w:proofErr w:type="spellStart"/>
+      <w:r/>
+      <w:proofErr w:type="spellEnd"/>
+      <w:r/>
     </w:p>
     <w:p>
       <w:proofErr w:type="spellStart"/>
@@ -12349,6 +12249,20 @@
       <w:proofErr w:type="spellEnd"/>
       <w:r>
         <w:t>.</w:t>
+      </w:r>
+    </w:p>
+    <w:p>
+      <w:pPr>
+        <w:pStyle w:val="Ttulo2"/>
+      </w:pPr>
+      <w:r>
+        <w:t>9.12 Contraseñas y recuperación</w:t>
+      </w:r>
+    </w:p>
+    <w:p>
+      <w:pPr/>
+      <w:r>
+        <w:t>Configura la caducidad de las contraseñas: días de validez (0 = sin caducidad, por defecto 90) y el dominio de correo que se concatena al usuario para recuperar la contraseña (por defecto @trenesargentinos.gob.ar).</w:t>
       </w:r>
     </w:p>
     <w:p>

</xml_diff>